<commit_message>
Auditoría general 29/09 + manuales
</commit_message>
<xml_diff>
--- a/docs/manuales/manual-control-facturas.docx
+++ b/docs/manuales/manual-control-facturas.docx
@@ -32,7 +32,7 @@
           <w:sz w:val="19"/>
           <w:szCs w:val="19"/>
         </w:rPr>
-        <w:t xml:space="preserve">Sistema Nova Express · versión 01/09/2026 · las fotos son del sistema real</w:t>
+        <w:t>Sistema Nova Express · versión 29/09/2026 (reemplaza a la del 01/09) · las fotos son del sistema real</w:t>
       </w:r>
     </w:p>
     <w:p>
@@ -849,6 +849,164 @@
           <w:sz w:val="24"/>
           <w:szCs w:val="24"/>
         </w:rPr>
+        <w:t>LA FACTURA DE IMPUESTOS DDP</w:t>
+      </w:r>
+    </w:p>
+    <w:p>
+      <w:pPr>
+        <w:spacing w:after="80"/>
+      </w:pPr>
+      <w:r>
+        <w:rPr>
+          <w:rFonts w:ascii="Calibri" w:cs="Calibri" w:eastAsia="Calibri" w:hAnsi="Calibri"/>
+          <w:b w:val="false"/>
+          <w:bCs w:val="false"/>
+          <w:i w:val="false"/>
+          <w:iCs w:val="false"/>
+          <w:sz w:val="20"/>
+          <w:szCs w:val="20"/>
+        </w:rPr>
+        <w:t>Los envíos DDP (impuestos de destino a cargo de Nova) tienen una segunda factura de UPS, que llega 1 o 2 meses después de la del flete y trae solo los impuestos. Se carga por el mismo lugar que cualquier factura: el sistema la reconoce solo por el contenido y avisa con un cartel "Factura de IMPUESTOS DDP".</w:t>
+      </w:r>
+    </w:p>
+    <w:p>
+      <w:pPr>
+        <w:spacing w:after="40"/>
+        <w:ind w:left="300" w:hanging="300"/>
+      </w:pPr>
+      <w:r>
+        <w:rPr>
+          <w:rFonts w:ascii="Calibri" w:cs="Calibri" w:eastAsia="Calibri" w:hAnsi="Calibri"/>
+          <w:b/>
+          <w:bCs/>
+          <w:color w:val="EE6C52"/>
+          <w:sz w:val="20"/>
+          <w:szCs w:val="20"/>
+        </w:rPr>
+        <w:t xml:space="preserve">A  </w:t>
+      </w:r>
+      <w:r>
+        <w:rPr>
+          <w:rFonts w:ascii="Calibri" w:cs="Calibri" w:eastAsia="Calibri" w:hAnsi="Calibri"/>
+          <w:b/>
+          <w:bCs/>
+          <w:sz w:val="20"/>
+          <w:szCs w:val="20"/>
+        </w:rPr>
+        <w:t>No toca el flete</w:t>
+      </w:r>
+      <w:r>
+        <w:rPr>
+          <w:rFonts w:ascii="Calibri" w:cs="Calibri" w:eastAsia="Calibri" w:hAnsi="Calibri"/>
+          <w:sz w:val="20"/>
+          <w:szCs w:val="20"/>
+        </w:rPr>
+        <w:t xml:space="preserve"> — cruza cada guía con su envío y guarda los impuestos en columnas aparte. No pisa el Costo UPS ni la revisión del flete.</w:t>
+      </w:r>
+    </w:p>
+    <w:p>
+      <w:pPr>
+        <w:spacing w:after="40"/>
+        <w:ind w:left="300" w:hanging="300"/>
+      </w:pPr>
+      <w:r>
+        <w:rPr>
+          <w:rFonts w:ascii="Calibri" w:cs="Calibri" w:eastAsia="Calibri" w:hAnsi="Calibri"/>
+          <w:b/>
+          <w:bCs/>
+          <w:color w:val="EE6C52"/>
+          <w:sz w:val="20"/>
+          <w:szCs w:val="20"/>
+        </w:rPr>
+        <w:t xml:space="preserve">B  </w:t>
+      </w:r>
+      <w:r>
+        <w:rPr>
+          <w:rFonts w:ascii="Calibri" w:cs="Calibri" w:eastAsia="Calibri" w:hAnsi="Calibri"/>
+          <w:b/>
+          <w:bCs/>
+          <w:sz w:val="20"/>
+          <w:szCs w:val="20"/>
+        </w:rPr>
+        <w:t>Crea el cargo al cliente</w:t>
+      </w:r>
+      <w:r>
+        <w:rPr>
+          <w:rFonts w:ascii="Calibri" w:cs="Calibri" w:eastAsia="Calibri" w:hAnsi="Calibri"/>
+          <w:sz w:val="20"/>
+          <w:szCs w:val="20"/>
+        </w:rPr>
+        <w:t xml:space="preserve"> — el importe de impuestos queda como "cargo posterior" del envío (se ve en Salidas: el chip DDP pasa a azul con el importe, y el chip naranja "cargo"). Si el envío todavía no se liquidó, entra en su liquidación; si ya estaba liquidado, entra solo en la PRÓXIMA liquidación de ese cliente como "cargo de envío anterior". No hay que cargar nada a mano.</w:t>
+      </w:r>
+    </w:p>
+    <w:p>
+      <w:pPr>
+        <w:spacing w:after="40"/>
+        <w:ind w:left="300" w:hanging="300"/>
+      </w:pPr>
+      <w:r>
+        <w:rPr>
+          <w:rFonts w:ascii="Calibri" w:cs="Calibri" w:eastAsia="Calibri" w:hAnsi="Calibri"/>
+          <w:b/>
+          <w:bCs/>
+          <w:color w:val="EE6C52"/>
+          <w:sz w:val="20"/>
+          <w:szCs w:val="20"/>
+        </w:rPr>
+        <w:t xml:space="preserve">C  </w:t>
+      </w:r>
+      <w:r>
+        <w:rPr>
+          <w:rFonts w:ascii="Calibri" w:cs="Calibri" w:eastAsia="Calibri" w:hAnsi="Calibri"/>
+          <w:b/>
+          <w:bCs/>
+          <w:sz w:val="20"/>
+          <w:szCs w:val="20"/>
+        </w:rPr>
+        <w:t>Si el envío no era DDP</w:t>
+      </w:r>
+      <w:r>
+        <w:rPr>
+          <w:rFonts w:ascii="Calibri" w:cs="Calibri" w:eastAsia="Calibri" w:hAnsi="Calibri"/>
+          <w:sz w:val="20"/>
+          <w:szCs w:val="20"/>
+        </w:rPr>
+        <w:t xml:space="preserve"> — UPS facturó impuestos a un envío cargado sin la tilde DDP. En Salidas aparece el chip rojo "¡Imp. sin DDP!": o el envío se cargó mal, o UPS cobró algo que no correspondía. Hay que mirarlo antes de cobrárselo al cliente.</w:t>
+      </w:r>
+    </w:p>
+    <w:p>
+      <w:pPr>
+        <w:pBdr>
+          <w:left w:val="single" w:color="000000" w:sz="18"/>
+        </w:pBdr>
+        <w:shd w:fill="F2F2F2" w:val="clear"/>
+        <w:spacing w:after="80" w:before="80"/>
+        <w:ind w:left="160" w:right="120"/>
+      </w:pPr>
+      <w:r>
+        <w:rPr>
+          <w:rFonts w:ascii="Calibri" w:cs="Calibri" w:eastAsia="Calibri" w:hAnsi="Calibri"/>
+          <w:sz w:val="19"/>
+          <w:szCs w:val="19"/>
+        </w:rPr>
+        <w:t>Si el cargo de impuestos ya se cobró en una liquidación CONFIRMADA y se vuelve a cargar la factura con otro importe, el sistema no lo toca y lo avisa con "Ojo" en el resumen. La diferencia hay que resolverla a mano.</w:t>
+      </w:r>
+    </w:p>
+    <w:p>
+      <w:pPr>
+        <w:pBdr>
+          <w:bottom w:val="single" w:color="000000" w:sz="10"/>
+        </w:pBdr>
+        <w:spacing w:after="100" w:before="240"/>
+      </w:pPr>
+      <w:r>
+        <w:rPr>
+          <w:rFonts w:ascii="Calibri" w:cs="Calibri" w:eastAsia="Calibri" w:hAnsi="Calibri"/>
+          <w:b/>
+          <w:bCs/>
+          <w:sz w:val="24"/>
+          <w:szCs w:val="24"/>
+        </w:rPr>
         <w:t xml:space="preserve">LA SOLAPA "REVISAR GUÍAS" — DONDE SE APRUEBA O SE RECLAMA</w:t>
       </w:r>
     </w:p>
@@ -1435,15 +1593,15 @@
           <w:sz w:val="20"/>
           <w:szCs w:val="20"/>
         </w:rPr>
-        <w:t xml:space="preserve">DIF COSTO</w:t>
-      </w:r>
-      <w:r>
-        <w:rPr>
-          <w:rFonts w:ascii="Calibri" w:cs="Calibri" w:eastAsia="Calibri" w:hAnsi="Calibri"/>
-          <w:sz w:val="20"/>
-          <w:szCs w:val="20"/>
-        </w:rPr>
-        <w:t xml:space="preserve"> — cuánto se desvió lo real de lo estimado. Se pinta de rojo si pasa la tolerancia.</w:t>
+        <w:t>% REAL</w:t>
+      </w:r>
+      <w:r>
+        <w:rPr>
+          <w:rFonts w:ascii="Calibri" w:cs="Calibri" w:eastAsia="Calibri" w:hAnsi="Calibri"/>
+          <w:sz w:val="20"/>
+          <w:szCs w:val="20"/>
+        </w:rPr>
+        <w:t xml:space="preserve"> — el porcentaje de ganancia real de esa guía: (venta − Costo UPS) / Costo UPS. Reemplazó a la vieja columna "Dif Costo". El Costo UPS se pinta de rojo si se desvió de la estimación más de la tolerancia.</w:t>
       </w:r>
     </w:p>
     <w:p>
@@ -2049,6 +2207,30 @@
     </w:p>
     <w:p>
       <w:pPr>
+        <w:spacing w:after="50"/>
+        <w:ind w:left="300" w:hanging="300"/>
+      </w:pPr>
+      <w:r>
+        <w:rPr>
+          <w:rFonts w:ascii="Calibri" w:cs="Calibri" w:eastAsia="Calibri" w:hAnsi="Calibri"/>
+          <w:b/>
+          <w:bCs/>
+          <w:sz w:val="20"/>
+          <w:szCs w:val="20"/>
+        </w:rPr>
+        <w:t xml:space="preserve">6. </w:t>
+      </w:r>
+      <w:r>
+        <w:rPr>
+          <w:rFonts w:ascii="Calibri" w:cs="Calibri" w:eastAsia="Calibri" w:hAnsi="Calibri"/>
+          <w:sz w:val="20"/>
+          <w:szCs w:val="20"/>
+        </w:rPr>
+        <w:t>Cargar también las facturas de IMPUESTOS DDP que hayan llegado (son de envíos de 1 o 2 meses atrás). Los cargos al cliente se crean solos.</w:t>
+      </w:r>
+    </w:p>
+    <w:p>
+      <w:pPr>
         <w:pBdr>
           <w:left w:val="single" w:color="000000" w:sz="18"/>
         </w:pBdr>
@@ -2084,6 +2266,8 @@
       </w:r>
     </w:p>
     <w:sectPr>
+      <w:footerReference w:type="default" r:id="rId13"/>
+      <w:headerReference w:type="default" r:id="rId14"/>
       <w:pgSz w:w="12240" w:h="15840" w:orient="portrait"/>
       <w:pgMar w:top="720" w:right="900" w:bottom="620" w:left="900" w:header="708" w:footer="708" w:gutter="0"/>
       <w:pgNumType/>
@@ -2134,6 +2318,16 @@
 </w:endnotes>
 </file>
 
+<file path=word/footer1.xml><?xml version="1.0" encoding="utf-8"?>
+<w:ftr xmlns:m="http://schemas.openxmlformats.org/officeDocument/2006/math" xmlns:mc="http://schemas.openxmlformats.org/markup-compatibility/2006" xmlns:mo="http://schemas.microsoft.com/office/mac/office/2008/main" xmlns:mv="urn:schemas-microsoft-com:mac:vml" xmlns:o="urn:schemas-microsoft-com:office:office" xmlns:r="http://schemas.openxmlformats.org/officeDocument/2006/relationships" xmlns:v="urn:schemas-microsoft-com:vml" xmlns:w10="urn:schemas-microsoft-com:office:word" xmlns:w14="http://schemas.microsoft.com/office/word/2010/wordml" xmlns:w="http://schemas.openxmlformats.org/wordprocessingml/2006/main" xmlns:wne="http://schemas.microsoft.com/office/word/2006/wordml" xmlns:wp14="http://schemas.microsoft.com/office/word/2010/wordprocessingDrawing" xmlns:wp="http://schemas.openxmlformats.org/drawingml/2006/wordprocessingDrawing" xmlns:wpc="http://schemas.microsoft.com/office/word/2010/wordprocessingCanvas" xmlns:wpg="http://schemas.microsoft.com/office/word/2010/wordprocessingGroup" xmlns:wpi="http://schemas.microsoft.com/office/word/2010/wordprocessingInk" xmlns:wps="http://schemas.microsoft.com/office/word/2010/wordprocessingShape" mc:Ignorable="w14 wp14">
+  <w:p>
+    <w:pPr>
+      <w:pStyle w:val="Footer"/>
+    </w:pPr>
+  </w:p>
+</w:ftr>
+</file>
+
 <file path=word/footnotes.xml><?xml version="1.0" encoding="utf-8"?>
 <w:footnotes xmlns:wpc="http://schemas.microsoft.com/office/word/2010/wordprocessingCanvas" xmlns:mc="http://schemas.openxmlformats.org/markup-compatibility/2006" xmlns:o="urn:schemas-microsoft-com:office:office" xmlns:r="http://schemas.openxmlformats.org/officeDocument/2006/relationships" xmlns:m="http://schemas.openxmlformats.org/officeDocument/2006/math" xmlns:v="urn:schemas-microsoft-com:vml" xmlns:wp14="http://schemas.microsoft.com/office/word/2010/wordprocessingDrawing" xmlns:wp="http://schemas.openxmlformats.org/drawingml/2006/wordprocessingDrawing" xmlns:w10="urn:schemas-microsoft-com:office:word" xmlns:w="http://schemas.openxmlformats.org/wordprocessingml/2006/main" xmlns:w14="http://schemas.microsoft.com/office/word/2010/wordml" xmlns:w15="http://schemas.microsoft.com/office/word/2012/wordml" xmlns:wpg="http://schemas.microsoft.com/office/word/2010/wordprocessingGroup" xmlns:wpi="http://schemas.microsoft.com/office/word/2010/wordprocessingInk" xmlns:wne="http://schemas.microsoft.com/office/word/2006/wordml" xmlns:wps="http://schemas.microsoft.com/office/word/2010/wordprocessingShape" mc:Ignorable="w14 w15 wp14">
   <w:footnote w:type="separator" w:id="-1">
@@ -2169,6 +2363,16 @@
     </w:p>
   </w:footnote>
 </w:footnotes>
+</file>
+
+<file path=word/header1.xml><?xml version="1.0" encoding="utf-8"?>
+<w:hdr xmlns:m="http://schemas.openxmlformats.org/officeDocument/2006/math" xmlns:mc="http://schemas.openxmlformats.org/markup-compatibility/2006" xmlns:mo="http://schemas.microsoft.com/office/mac/office/2008/main" xmlns:mv="urn:schemas-microsoft-com:mac:vml" xmlns:o="urn:schemas-microsoft-com:office:office" xmlns:r="http://schemas.openxmlformats.org/officeDocument/2006/relationships" xmlns:v="urn:schemas-microsoft-com:vml" xmlns:w10="urn:schemas-microsoft-com:office:word" xmlns:w14="http://schemas.microsoft.com/office/word/2010/wordml" xmlns:w="http://schemas.openxmlformats.org/wordprocessingml/2006/main" xmlns:wne="http://schemas.microsoft.com/office/word/2006/wordml" xmlns:wp14="http://schemas.microsoft.com/office/word/2010/wordprocessingDrawing" xmlns:wp="http://schemas.openxmlformats.org/drawingml/2006/wordprocessingDrawing" xmlns:wpc="http://schemas.microsoft.com/office/word/2010/wordprocessingCanvas" xmlns:wpg="http://schemas.microsoft.com/office/word/2010/wordprocessingGroup" xmlns:wpi="http://schemas.microsoft.com/office/word/2010/wordprocessingInk" xmlns:wps="http://schemas.microsoft.com/office/word/2010/wordprocessingShape" mc:Ignorable="w14 wp14">
+  <w:p>
+    <w:pPr>
+      <w:pStyle w:val="Header"/>
+    </w:pPr>
+  </w:p>
+</w:hdr>
 </file>
 
 <file path=word/numbering.xml><?xml version="1.0" encoding="utf-8"?>

</xml_diff>